<commit_message>
Show readable profile URLs in resume downloads
</commit_message>
<xml_diff>
--- a/public/matthew-rundle-resume.docx
+++ b/public/matthew-rundle-resume.docx
@@ -71,7 +71,7 @@
             <w:color w:val="4A5568"/>
             <w:sz w:val="19"/>
           </w:rPr>
-          <w:t>LinkedIn</w:t>
+          <w:t>linkedin.com/in/matthewtrundle</w:t>
         </w:r>
       </w:hyperlink>
       <w:r>
@@ -89,7 +89,7 @@
             <w:color w:val="4A5568"/>
             <w:sz w:val="19"/>
           </w:rPr>
-          <w:t>GitHub</w:t>
+          <w:t>github.com/matthewtrundle</w:t>
         </w:r>
       </w:hyperlink>
     </w:p>

</xml_diff>